<commit_message>
Ajout des slides, module et generateur FIC dans le repo
</commit_message>
<xml_diff>
--- a/_demos/Demo_FIC.docx
+++ b/_demos/Demo_FIC.docx
@@ -324,7 +324,7 @@
           <w:sz w:val="22"/>
           <w:szCs w:val="22"/>
         </w:rPr>
-        <w:t xml:space="preserve"> : un fichier texte survit à la mort du programme qui l'a écrit, un fichier binaire non.</w:t>
+        <w:t xml:space="preserve"> : un fichier texte survit aux évolutions du programme qui l'a écrit, un fichier binaire non.</w:t>
       </w:r>
     </w:p>
     <w:p>
@@ -1860,7 +1860,7 @@
                 <w:sz w:val="18"/>
                 <w:szCs w:val="18"/>
               </w:rPr>
-              <w:t xml:space="preserve">CC-ERR.1</w:t>
+              <w:t xml:space="preserve">CC-ERR.6</w:t>
             </w:r>
           </w:p>
         </w:tc>
@@ -1883,7 +1883,7 @@
                 <w:sz w:val="20"/>
                 <w:szCs w:val="20"/>
               </w:rPr>
-              <w:t xml:space="preserve">ne pas avaler une exception</w:t>
+              <w:t xml:space="preserve">n'avalez pas une exception en silence</w:t>
             </w:r>
           </w:p>
         </w:tc>
@@ -1912,7 +1912,7 @@
                 <w:sz w:val="18"/>
                 <w:szCs w:val="18"/>
               </w:rPr>
-              <w:t xml:space="preserve">GEN.1</w:t>
+              <w:t xml:space="preserve">GEN 3.3 et 3.5</w:t>
             </w:r>
           </w:p>
         </w:tc>
@@ -1935,7 +1935,7 @@
                 <w:sz w:val="20"/>
                 <w:szCs w:val="20"/>
               </w:rPr>
-              <w:t xml:space="preserve">l'effacement de type, qui explique le transtypage à la relecture</w:t>
+              <w:t xml:space="preserve">deck GEN : l'effacement de type, qui explique le transtypage à la relecture</w:t>
             </w:r>
           </w:p>
         </w:tc>

</xml_diff>